<commit_message>
EHIS-5429 [ Pool Construction Permit defect]
</commit_message>
<xml_diff>
--- a/PHOCS-Docgentemplates/PHOCSPoolConstructionPermitTemplate_v1.docx
+++ b/PHOCS-Docgentemplates/PHOCSPoolConstructionPermitTemplate_v1.docx
@@ -16,32 +16,7 @@
           <w:rFonts w:ascii="BC Sans" w:hAnsi="BC Sans"/>
           <w:color w:val="000000" w:themeColor="text1"/>
         </w:rPr>
-        <w:t>{{</w:t>
-      </w:r>
-      <w:proofErr w:type="spellStart"/>
-      <w:r>
-        <w:rPr>
-          <w:rFonts w:ascii="BC Sans" w:hAnsi="BC Sans"/>
-          <w:color w:val="000000" w:themeColor="text1"/>
-        </w:rPr>
-        <w:t>BLEffectiveDate</w:t>
-      </w:r>
-      <w:proofErr w:type="spellEnd"/>
-      <w:proofErr w:type="gramStart"/>
-      <w:r>
-        <w:rPr>
-          <w:rFonts w:ascii="BC Sans" w:hAnsi="BC Sans"/>
-          <w:color w:val="000000" w:themeColor="text1"/>
-        </w:rPr>
-        <w:t xml:space="preserve">}}   </w:t>
-      </w:r>
-      <w:proofErr w:type="gramEnd"/>
-      <w:r>
-        <w:rPr>
-          <w:rFonts w:ascii="BC Sans" w:hAnsi="BC Sans"/>
-          <w:color w:val="000000" w:themeColor="text1"/>
-        </w:rPr>
-        <w:t xml:space="preserve">                                      </w:t>
+        <w:t xml:space="preserve">{{BLEffectiveDate}}                                         </w:t>
       </w:r>
       <w:r>
         <w:rPr>
@@ -55,228 +30,116 @@
           <w:rFonts w:ascii="BC Sans" w:hAnsi="BC Sans"/>
           <w:color w:val="000000" w:themeColor="text1"/>
         </w:rPr>
-        <w:t xml:space="preserve">            </w:t>
-      </w:r>
-      <w:proofErr w:type="gramStart"/>
-      <w:r>
-        <w:rPr>
-          <w:rFonts w:ascii="BC Sans" w:hAnsi="BC Sans"/>
-          <w:color w:val="000000" w:themeColor="text1"/>
-        </w:rPr>
-        <w:t xml:space="preserve">   </w:t>
-      </w:r>
-      <w:r>
-        <w:rPr>
-          <w:rFonts w:ascii="BC Sans" w:hAnsi="BC Sans"/>
-          <w:color w:val="000000" w:themeColor="text1"/>
-        </w:rPr>
-        <w:t>{</w:t>
-      </w:r>
-      <w:proofErr w:type="gramEnd"/>
-      <w:r>
-        <w:rPr>
-          <w:rFonts w:ascii="BC Sans" w:hAnsi="BC Sans"/>
-          <w:color w:val="000000" w:themeColor="text1"/>
-        </w:rPr>
-        <w:t>{</w:t>
-      </w:r>
-      <w:proofErr w:type="spellStart"/>
-      <w:r>
-        <w:rPr>
-          <w:rFonts w:ascii="BC Sans" w:hAnsi="BC Sans"/>
-          <w:color w:val="000000" w:themeColor="text1"/>
-        </w:rPr>
-        <w:t>BLAName</w:t>
-      </w:r>
-      <w:proofErr w:type="spellEnd"/>
-      <w:r>
-        <w:rPr>
-          <w:rFonts w:ascii="BC Sans" w:hAnsi="BC Sans"/>
-          <w:color w:val="000000" w:themeColor="text1"/>
+        <w:t xml:space="preserve">               </w:t>
+      </w:r>
+      <w:r>
+        <w:rPr>
+          <w:rFonts w:ascii="BC Sans" w:hAnsi="BC Sans"/>
+          <w:color w:val="000000" w:themeColor="text1"/>
+        </w:rPr>
+        <w:t>{{BLAName}}</w:t>
+      </w:r>
+    </w:p>
+    <w:p>
+      <w:pPr>
+        <w:rPr>
+          <w:rFonts w:ascii="BC Sans" w:hAnsi="BC Sans"/>
+          <w:color w:val="000000" w:themeColor="text1"/>
+          <w:lang w:val="en-CA"/>
+        </w:rPr>
+      </w:pPr>
+      <w:r>
+        <w:rPr>
+          <w:rFonts w:ascii="BC Sans" w:hAnsi="BC Sans"/>
+          <w:color w:val="000000" w:themeColor="text1"/>
+        </w:rPr>
+        <w:t>{{BLAEngineeringDesignFirmName}}</w:t>
+      </w:r>
+      <w:r>
+        <w:rPr>
+          <w:rFonts w:ascii="BC Sans" w:hAnsi="BC Sans"/>
+          <w:color w:val="000000" w:themeColor="text1"/>
+        </w:rPr>
+        <w:br/>
+      </w:r>
+      <w:r>
+        <w:rPr>
+          <w:rFonts w:ascii="BC Sans" w:hAnsi="BC Sans"/>
+          <w:color w:val="000000" w:themeColor="text1"/>
+          <w:lang w:val="en-CA"/>
+        </w:rPr>
+        <w:t>{{BLAApplicantAddressStreet}}</w:t>
+      </w:r>
+    </w:p>
+    <w:p>
+      <w:pPr>
+        <w:spacing w:after="300"/>
+        <w:rPr>
+          <w:rFonts w:ascii="BC Sans" w:hAnsi="BC Sans"/>
+          <w:color w:val="000000" w:themeColor="text1"/>
+          <w:lang w:val="en-CA"/>
+        </w:rPr>
+      </w:pPr>
+      <w:r>
+        <w:rPr>
+          <w:rFonts w:ascii="BC Sans" w:hAnsi="BC Sans"/>
+          <w:color w:val="000000" w:themeColor="text1"/>
+          <w:lang w:val="en-CA"/>
+        </w:rPr>
+        <w:t>{{BLAApplicantAddressCity}}</w:t>
+      </w:r>
+      <w:r>
+        <w:rPr>
+          <w:rFonts w:ascii="BC Sans" w:hAnsi="BC Sans"/>
+          <w:color w:val="000000" w:themeColor="text1"/>
+        </w:rPr>
+        <w:t xml:space="preserve">, </w:t>
+      </w:r>
+      <w:r>
+        <w:rPr>
+          <w:rFonts w:ascii="BC Sans" w:hAnsi="BC Sans"/>
+          <w:color w:val="000000" w:themeColor="text1"/>
+          <w:lang w:val="en-CA"/>
+        </w:rPr>
+        <w:t>{{BLAApplicantAddressState</w:t>
+      </w:r>
+      <w:r>
+        <w:rPr>
+          <w:rFonts w:ascii="BC Sans" w:hAnsi="BC Sans"/>
+          <w:color w:val="000000" w:themeColor="text1"/>
+          <w:lang w:val="en-CA"/>
+        </w:rPr>
+        <w:t>Code</w:t>
+      </w:r>
+      <w:r>
+        <w:rPr>
+          <w:rFonts w:ascii="BC Sans" w:hAnsi="BC Sans"/>
+          <w:color w:val="000000" w:themeColor="text1"/>
+          <w:lang w:val="en-CA"/>
         </w:rPr>
         <w:t>}}</w:t>
       </w:r>
-    </w:p>
-    <w:p>
-      <w:pPr>
+      <w:r>
+        <w:rPr>
+          <w:rFonts w:ascii="BC Sans" w:hAnsi="BC Sans"/>
+          <w:color w:val="000000" w:themeColor="text1"/>
+        </w:rPr>
+        <w:t>,</w:t>
+      </w:r>
+      <w:r>
+        <w:rPr>
+          <w:rFonts w:ascii="BC Sans" w:hAnsi="BC Sans"/>
+          <w:color w:val="000000" w:themeColor="text1"/>
+        </w:rPr>
+        <w:br/>
+      </w:r>
+      <w:r>
         <w:rPr>
           <w:rFonts w:ascii="BC Sans" w:hAnsi="BC Sans"/>
           <w:color w:val="000000" w:themeColor="text1"/>
           <w:lang w:val="en-CA"/>
         </w:rPr>
-      </w:pPr>
-      <w:r>
-        <w:rPr>
-          <w:rFonts w:ascii="BC Sans" w:hAnsi="BC Sans"/>
-          <w:color w:val="000000" w:themeColor="text1"/>
-        </w:rPr>
-        <w:t>{{</w:t>
-      </w:r>
-      <w:proofErr w:type="spellStart"/>
-      <w:r>
-        <w:rPr>
-          <w:rFonts w:ascii="BC Sans" w:hAnsi="BC Sans"/>
-          <w:color w:val="000000" w:themeColor="text1"/>
-        </w:rPr>
-        <w:t>BLAEngineeringDesignFirmName</w:t>
-      </w:r>
-      <w:proofErr w:type="spellEnd"/>
-      <w:r>
-        <w:rPr>
-          <w:rFonts w:ascii="BC Sans" w:hAnsi="BC Sans"/>
-          <w:color w:val="000000" w:themeColor="text1"/>
-        </w:rPr>
-        <w:t>}}</w:t>
-      </w:r>
-      <w:r>
-        <w:rPr>
-          <w:rFonts w:ascii="BC Sans" w:hAnsi="BC Sans"/>
-          <w:color w:val="000000" w:themeColor="text1"/>
-        </w:rPr>
-        <w:br/>
-      </w:r>
-      <w:r>
-        <w:rPr>
-          <w:rFonts w:ascii="BC Sans" w:hAnsi="BC Sans"/>
-          <w:color w:val="000000" w:themeColor="text1"/>
-          <w:lang w:val="en-CA"/>
-        </w:rPr>
-        <w:t>{{</w:t>
-      </w:r>
-      <w:proofErr w:type="spellStart"/>
-      <w:r>
-        <w:rPr>
-          <w:rFonts w:ascii="BC Sans" w:hAnsi="BC Sans"/>
-          <w:color w:val="000000" w:themeColor="text1"/>
-          <w:lang w:val="en-CA"/>
-        </w:rPr>
-        <w:t>BLAApplicantAddressStreet</w:t>
-      </w:r>
-      <w:proofErr w:type="spellEnd"/>
-      <w:r>
-        <w:rPr>
-          <w:rFonts w:ascii="BC Sans" w:hAnsi="BC Sans"/>
-          <w:color w:val="000000" w:themeColor="text1"/>
-          <w:lang w:val="en-CA"/>
-        </w:rPr>
-        <w:t>}}</w:t>
-      </w:r>
-    </w:p>
-    <w:p>
-      <w:pPr>
-        <w:spacing w:after="300"/>
-        <w:rPr>
-          <w:rFonts w:ascii="BC Sans" w:hAnsi="BC Sans"/>
-          <w:color w:val="000000" w:themeColor="text1"/>
-          <w:lang w:val="en-CA"/>
-        </w:rPr>
-      </w:pPr>
-      <w:r>
-        <w:rPr>
-          <w:rFonts w:ascii="BC Sans" w:hAnsi="BC Sans"/>
-          <w:color w:val="000000" w:themeColor="text1"/>
-          <w:lang w:val="en-CA"/>
-        </w:rPr>
-        <w:t>{{</w:t>
-      </w:r>
-      <w:proofErr w:type="spellStart"/>
-      <w:r>
-        <w:rPr>
-          <w:rFonts w:ascii="BC Sans" w:hAnsi="BC Sans"/>
-          <w:color w:val="000000" w:themeColor="text1"/>
-          <w:lang w:val="en-CA"/>
-        </w:rPr>
-        <w:t>BLAApplicantAddressCity</w:t>
-      </w:r>
-      <w:proofErr w:type="spellEnd"/>
-      <w:r>
-        <w:rPr>
-          <w:rFonts w:ascii="BC Sans" w:hAnsi="BC Sans"/>
-          <w:color w:val="000000" w:themeColor="text1"/>
-          <w:lang w:val="en-CA"/>
-        </w:rPr>
-        <w:t>}}</w:t>
-      </w:r>
-      <w:r>
-        <w:rPr>
-          <w:rFonts w:ascii="BC Sans" w:hAnsi="BC Sans"/>
-          <w:color w:val="000000" w:themeColor="text1"/>
-        </w:rPr>
-        <w:t xml:space="preserve">, </w:t>
-      </w:r>
-      <w:r>
-        <w:rPr>
-          <w:rFonts w:ascii="BC Sans" w:hAnsi="BC Sans"/>
-          <w:color w:val="000000" w:themeColor="text1"/>
-          <w:lang w:val="en-CA"/>
-        </w:rPr>
-        <w:t>{{</w:t>
-      </w:r>
-      <w:proofErr w:type="spellStart"/>
-      <w:r>
-        <w:rPr>
-          <w:rFonts w:ascii="BC Sans" w:hAnsi="BC Sans"/>
-          <w:color w:val="000000" w:themeColor="text1"/>
-          <w:lang w:val="en-CA"/>
-        </w:rPr>
-        <w:t>BLAApplicantAddressState</w:t>
-      </w:r>
-      <w:r>
-        <w:rPr>
-          <w:rFonts w:ascii="BC Sans" w:hAnsi="BC Sans"/>
-          <w:color w:val="000000" w:themeColor="text1"/>
-          <w:lang w:val="en-CA"/>
-        </w:rPr>
-        <w:t>Code</w:t>
-      </w:r>
-      <w:proofErr w:type="spellEnd"/>
-      <w:r>
-        <w:rPr>
-          <w:rFonts w:ascii="BC Sans" w:hAnsi="BC Sans"/>
-          <w:color w:val="000000" w:themeColor="text1"/>
-          <w:lang w:val="en-CA"/>
-        </w:rPr>
-        <w:t>}}</w:t>
-      </w:r>
-      <w:r>
-        <w:rPr>
-          <w:rFonts w:ascii="BC Sans" w:hAnsi="BC Sans"/>
-          <w:color w:val="000000" w:themeColor="text1"/>
-        </w:rPr>
-        <w:t>,</w:t>
-      </w:r>
-      <w:r>
-        <w:rPr>
-          <w:rFonts w:ascii="BC Sans" w:hAnsi="BC Sans"/>
-          <w:color w:val="000000" w:themeColor="text1"/>
-        </w:rPr>
-        <w:br/>
-      </w:r>
-      <w:r>
-        <w:rPr>
-          <w:rFonts w:ascii="BC Sans" w:hAnsi="BC Sans"/>
-          <w:color w:val="000000" w:themeColor="text1"/>
-          <w:lang w:val="en-CA"/>
-        </w:rPr>
-        <w:t>{{</w:t>
-      </w:r>
-      <w:proofErr w:type="spellStart"/>
-      <w:r>
-        <w:rPr>
-          <w:rFonts w:ascii="BC Sans" w:hAnsi="BC Sans"/>
-          <w:color w:val="000000" w:themeColor="text1"/>
-          <w:lang w:val="en-CA"/>
-        </w:rPr>
-        <w:t>BLAApplicantAddressPostalCode</w:t>
-      </w:r>
-      <w:proofErr w:type="spellEnd"/>
-      <w:r>
-        <w:rPr>
-          <w:rFonts w:ascii="BC Sans" w:hAnsi="BC Sans"/>
-          <w:color w:val="000000" w:themeColor="text1"/>
-          <w:lang w:val="en-CA"/>
-        </w:rPr>
-        <w:t>}}</w:t>
+        <w:t>{{BLAApplicantAddressPostalCode}}</w:t>
       </w:r>
     </w:p>
     <w:p>
@@ -296,9 +159,17 @@
           <w:bCs/>
           <w:color w:val="000000" w:themeColor="text1"/>
         </w:rPr>
-        <w:t>{{AccountCategoryL2}} located at {{</w:t>
-      </w:r>
-      <w:proofErr w:type="spellStart"/>
+        <w:t>{{AccountCategoryL2}} located at {{BLAccountPhysicalAddress}}</w:t>
+      </w:r>
+    </w:p>
+    <w:p>
+      <w:pPr>
+        <w:spacing w:after="300"/>
+        <w:rPr>
+          <w:rFonts w:ascii="BC Sans" w:hAnsi="BC Sans"/>
+          <w:color w:val="000000" w:themeColor="text1"/>
+        </w:rPr>
+      </w:pPr>
       <w:r>
         <w:rPr>
           <w:rFonts w:ascii="BC Sans" w:hAnsi="BC Sans"/>
@@ -306,69 +177,14 @@
           <w:bCs/>
           <w:color w:val="000000" w:themeColor="text1"/>
         </w:rPr>
-        <w:t>BLAccountPhysicalAddress</w:t>
-      </w:r>
-      <w:proofErr w:type="spellEnd"/>
-      <w:r>
-        <w:rPr>
-          <w:rFonts w:ascii="BC Sans" w:hAnsi="BC Sans"/>
-          <w:b/>
-          <w:bCs/>
-          <w:color w:val="000000" w:themeColor="text1"/>
-        </w:rPr>
-        <w:t>}}</w:t>
-      </w:r>
-    </w:p>
-    <w:p>
-      <w:pPr>
-        <w:spacing w:after="300"/>
-        <w:rPr>
-          <w:rFonts w:ascii="BC Sans" w:hAnsi="BC Sans"/>
-          <w:color w:val="000000" w:themeColor="text1"/>
-        </w:rPr>
-      </w:pPr>
-      <w:r>
-        <w:rPr>
-          <w:rFonts w:ascii="BC Sans" w:hAnsi="BC Sans"/>
-          <w:b/>
-          <w:bCs/>
-          <w:color w:val="000000" w:themeColor="text1"/>
-        </w:rPr>
-        <w:t xml:space="preserve">CONSTRUCTION PERMIT </w:t>
-      </w:r>
-      <w:proofErr w:type="gramStart"/>
-      <w:r>
-        <w:rPr>
-          <w:rFonts w:ascii="BC Sans" w:hAnsi="BC Sans"/>
-          <w:b/>
-          <w:bCs/>
-          <w:color w:val="000000" w:themeColor="text1"/>
-        </w:rPr>
-        <w:t>NO.</w:t>
-      </w:r>
-      <w:r>
-        <w:rPr>
-          <w:rFonts w:ascii="BC Sans" w:hAnsi="BC Sans"/>
-          <w:color w:val="000000" w:themeColor="text1"/>
-        </w:rPr>
-        <w:t xml:space="preserve"> {{</w:t>
-      </w:r>
-      <w:proofErr w:type="spellStart"/>
-      <w:proofErr w:type="gramEnd"/>
-      <w:r>
-        <w:rPr>
-          <w:rFonts w:ascii="BC Sans" w:hAnsi="BC Sans"/>
-          <w:color w:val="000000" w:themeColor="text1"/>
-        </w:rPr>
-        <w:t>BLIdentifier</w:t>
-      </w:r>
-      <w:proofErr w:type="spellEnd"/>
-      <w:r>
-        <w:rPr>
-          <w:rFonts w:ascii="BC Sans" w:hAnsi="BC Sans"/>
-          <w:color w:val="000000" w:themeColor="text1"/>
-        </w:rPr>
-        <w:t>}}</w:t>
+        <w:t>CONSTRUCTION PERMIT NO.</w:t>
+      </w:r>
+      <w:r>
+        <w:rPr>
+          <w:rFonts w:ascii="BC Sans" w:hAnsi="BC Sans"/>
+          <w:color w:val="000000" w:themeColor="text1"/>
+        </w:rPr>
+        <w:t xml:space="preserve"> {{BLIdentifier}}</w:t>
       </w:r>
     </w:p>
     <w:p>
@@ -661,19 +477,16 @@
           <w:sz w:val="20"/>
           <w:szCs w:val="20"/>
         </w:rPr>
-        <w:t>{{</w:t>
-      </w:r>
-      <w:proofErr w:type="spellStart"/>
-      <w:r>
-        <w:rPr>
-          <w:rFonts w:ascii="BC Sans" w:hAnsi="BC Sans"/>
-          <w:color w:val="000000" w:themeColor="text1"/>
+        <w:t>{{BLAClosedByName}}, [Credentials]</w:t>
+      </w:r>
+      <w:r>
+        <w:rPr>
+          <w:rFonts w:ascii="BC Sans" w:hAnsi="BC Sans"/>
           <w:sz w:val="20"/>
           <w:szCs w:val="20"/>
         </w:rPr>
-        <w:t>BLAClosedByName</w:t>
-      </w:r>
-      <w:proofErr w:type="spellEnd"/>
+        <w:br/>
+      </w:r>
       <w:r>
         <w:rPr>
           <w:rFonts w:ascii="BC Sans" w:hAnsi="BC Sans"/>
@@ -681,44 +494,7 @@
           <w:sz w:val="20"/>
           <w:szCs w:val="20"/>
         </w:rPr>
-        <w:t>}}, [Credentials]</w:t>
-      </w:r>
-      <w:r>
-        <w:rPr>
-          <w:rFonts w:ascii="BC Sans" w:hAnsi="BC Sans"/>
-          <w:sz w:val="20"/>
-          <w:szCs w:val="20"/>
-        </w:rPr>
-        <w:br/>
-      </w:r>
-      <w:r>
-        <w:rPr>
-          <w:rFonts w:ascii="BC Sans" w:hAnsi="BC Sans"/>
-          <w:color w:val="000000" w:themeColor="text1"/>
-          <w:sz w:val="20"/>
-          <w:szCs w:val="20"/>
-        </w:rPr>
-        <w:t>{{</w:t>
-      </w:r>
-      <w:proofErr w:type="spellStart"/>
-      <w:r>
-        <w:rPr>
-          <w:rFonts w:ascii="BC Sans" w:hAnsi="BC Sans"/>
-          <w:color w:val="000000" w:themeColor="text1"/>
-          <w:sz w:val="20"/>
-          <w:szCs w:val="20"/>
-        </w:rPr>
-        <w:t>BLAClosedByTitle</w:t>
-      </w:r>
-      <w:proofErr w:type="spellEnd"/>
-      <w:r>
-        <w:rPr>
-          <w:rFonts w:ascii="BC Sans" w:hAnsi="BC Sans"/>
-          <w:color w:val="000000" w:themeColor="text1"/>
-          <w:sz w:val="20"/>
-          <w:szCs w:val="20"/>
-        </w:rPr>
-        <w:t>}}</w:t>
+        <w:t>{{BLAClosedByTitle}}</w:t>
       </w:r>
     </w:p>
     <w:p>
@@ -768,16 +544,7 @@
           <w:sz w:val="20"/>
           <w:szCs w:val="20"/>
         </w:rPr>
-        <w:t>            </w:t>
-      </w:r>
-      <w:proofErr w:type="gramStart"/>
-      <w:r>
-        <w:rPr>
-          <w:rFonts w:ascii="BC Sans" w:hAnsi="BC Sans"/>
-          <w:sz w:val="20"/>
-          <w:szCs w:val="20"/>
-        </w:rPr>
-        <w:t>  </w:t>
+        <w:t>              </w:t>
       </w:r>
       <w:r>
         <w:rPr>
@@ -797,9 +564,8 @@
           <w:szCs w:val="20"/>
           <w:lang w:val="en-US"/>
         </w:rPr>
-        <w:t>[</w:t>
-      </w:r>
-      <w:proofErr w:type="gramEnd"/>
+        <w:t>[Name, Title, Organization]</w:t>
+      </w:r>
       <w:r>
         <w:rPr>
           <w:rStyle w:val="normaltextrun"/>
@@ -810,7 +576,15 @@
           <w:szCs w:val="20"/>
           <w:lang w:val="en-US"/>
         </w:rPr>
-        <w:t>Name, Title, Organization]</w:t>
+        <w:br/>
+      </w:r>
+      <w:r>
+        <w:rPr>
+          <w:rFonts w:ascii="BC Sans" w:hAnsi="BC Sans"/>
+          <w:sz w:val="20"/>
+          <w:szCs w:val="20"/>
+        </w:rPr>
+        <w:t>                  </w:t>
       </w:r>
       <w:r>
         <w:rPr>
@@ -822,6 +596,9 @@
           <w:szCs w:val="20"/>
           <w:lang w:val="en-US"/>
         </w:rPr>
+        <w:t>[Name, Title, Organization]</w:t>
+      </w:r>
+      <w:r>
         <w:br/>
       </w:r>
       <w:r>
@@ -830,84 +607,18 @@
           <w:sz w:val="20"/>
           <w:szCs w:val="20"/>
         </w:rPr>
-        <w:t>               </w:t>
-      </w:r>
-      <w:proofErr w:type="gramStart"/>
-      <w:r>
-        <w:rPr>
-          <w:rFonts w:ascii="BC Sans" w:hAnsi="BC Sans"/>
-          <w:sz w:val="20"/>
-          <w:szCs w:val="20"/>
-        </w:rPr>
-        <w:t>   </w:t>
-      </w:r>
-      <w:r>
-        <w:rPr>
-          <w:rStyle w:val="normaltextrun"/>
-          <w:rFonts w:ascii="BC Sans" w:hAnsi="BC Sans" w:cs="Segoe UI"/>
+        <w:t>                  </w:t>
+      </w:r>
+      <w:r>
+        <w:rPr>
+          <w:rFonts w:ascii="BC Sans" w:hAnsi="BC Sans"/>
           <w:i/>
           <w:iCs/>
           <w:sz w:val="20"/>
           <w:szCs w:val="20"/>
           <w:lang w:val="en-US"/>
         </w:rPr>
-        <w:t>[</w:t>
-      </w:r>
-      <w:proofErr w:type="gramEnd"/>
-      <w:r>
-        <w:rPr>
-          <w:rStyle w:val="normaltextrun"/>
-          <w:rFonts w:ascii="BC Sans" w:hAnsi="BC Sans" w:cs="Segoe UI"/>
-          <w:i/>
-          <w:iCs/>
-          <w:sz w:val="20"/>
-          <w:szCs w:val="20"/>
-          <w:lang w:val="en-US"/>
-        </w:rPr>
-        <w:t>Name, Title, Organization]</w:t>
-      </w:r>
-      <w:r>
-        <w:br/>
-      </w:r>
-      <w:r>
-        <w:rPr>
-          <w:rFonts w:ascii="BC Sans" w:hAnsi="BC Sans"/>
-          <w:sz w:val="20"/>
-          <w:szCs w:val="20"/>
-        </w:rPr>
-        <w:t>               </w:t>
-      </w:r>
-      <w:proofErr w:type="gramStart"/>
-      <w:r>
-        <w:rPr>
-          <w:rFonts w:ascii="BC Sans" w:hAnsi="BC Sans"/>
-          <w:sz w:val="20"/>
-          <w:szCs w:val="20"/>
-        </w:rPr>
-        <w:t>   </w:t>
-      </w:r>
-      <w:r>
-        <w:rPr>
-          <w:rFonts w:ascii="BC Sans" w:hAnsi="BC Sans"/>
-          <w:i/>
-          <w:iCs/>
-          <w:sz w:val="20"/>
-          <w:szCs w:val="20"/>
-          <w:lang w:val="en-US"/>
-        </w:rPr>
-        <w:t>[</w:t>
-      </w:r>
-      <w:proofErr w:type="gramEnd"/>
-      <w:r>
-        <w:rPr>
-          <w:rFonts w:ascii="BC Sans" w:hAnsi="BC Sans"/>
-          <w:i/>
-          <w:iCs/>
-          <w:sz w:val="20"/>
-          <w:szCs w:val="20"/>
-          <w:lang w:val="en-US"/>
-        </w:rPr>
-        <w:t>Name, Title, Organization]</w:t>
+        <w:t>[Name, Title, Organization]</w:t>
       </w:r>
     </w:p>
     <w:p>
@@ -1002,23 +713,7 @@
                 <w:rFonts w:ascii="BC Sans" w:hAnsi="BC Sans"/>
                 <w:color w:val="000000" w:themeColor="text1"/>
               </w:rPr>
-              <w:t>{{</w:t>
-            </w:r>
-            <w:proofErr w:type="spellStart"/>
-            <w:r>
-              <w:rPr>
-                <w:rFonts w:ascii="BC Sans" w:hAnsi="BC Sans"/>
-                <w:color w:val="000000" w:themeColor="text1"/>
-              </w:rPr>
-              <w:t>BLAccountName</w:t>
-            </w:r>
-            <w:proofErr w:type="spellEnd"/>
-            <w:r>
-              <w:rPr>
-                <w:rFonts w:ascii="BC Sans" w:hAnsi="BC Sans"/>
-                <w:color w:val="000000" w:themeColor="text1"/>
-              </w:rPr>
-              <w:t>}}</w:t>
+              <w:t>{{BLAccountName}}</w:t>
             </w:r>
           </w:p>
         </w:tc>
@@ -1063,24 +758,31 @@
                 <w:color w:val="000000" w:themeColor="text1"/>
                 <w:lang w:val="en-CA"/>
               </w:rPr>
-              <w:t>{{</w:t>
-            </w:r>
-            <w:proofErr w:type="spellStart"/>
+              <w:t>{{BLAccountPhysicalAddressStreet}}</w:t>
+            </w:r>
             <w:r>
               <w:rPr>
                 <w:rFonts w:ascii="BC Sans" w:hAnsi="BC Sans"/>
                 <w:color w:val="000000" w:themeColor="text1"/>
                 <w:lang w:val="en-CA"/>
               </w:rPr>
-              <w:t>BLAccountPhysicalAddressStreet</w:t>
-            </w:r>
-            <w:proofErr w:type="spellEnd"/>
+              <w:br/>
+              <w:t>{{BLAccountPhysicalAddressCity}}, {{BLAccountPhysicalAddressState</w:t>
+            </w:r>
             <w:r>
               <w:rPr>
                 <w:rFonts w:ascii="BC Sans" w:hAnsi="BC Sans"/>
                 <w:color w:val="000000" w:themeColor="text1"/>
                 <w:lang w:val="en-CA"/>
               </w:rPr>
+              <w:t>Code</w:t>
+            </w:r>
+            <w:r>
+              <w:rPr>
+                <w:rFonts w:ascii="BC Sans" w:hAnsi="BC Sans"/>
+                <w:color w:val="000000" w:themeColor="text1"/>
+                <w:lang w:val="en-CA"/>
+              </w:rPr>
               <w:t>}}</w:t>
             </w:r>
             <w:r>
@@ -1090,78 +792,7 @@
                 <w:lang w:val="en-CA"/>
               </w:rPr>
               <w:br/>
-              <w:t>{{</w:t>
-            </w:r>
-            <w:proofErr w:type="spellStart"/>
-            <w:r>
-              <w:rPr>
-                <w:rFonts w:ascii="BC Sans" w:hAnsi="BC Sans"/>
-                <w:color w:val="000000" w:themeColor="text1"/>
-                <w:lang w:val="en-CA"/>
-              </w:rPr>
-              <w:t>BLAccountPhysicalAddressCity</w:t>
-            </w:r>
-            <w:proofErr w:type="spellEnd"/>
-            <w:r>
-              <w:rPr>
-                <w:rFonts w:ascii="BC Sans" w:hAnsi="BC Sans"/>
-                <w:color w:val="000000" w:themeColor="text1"/>
-                <w:lang w:val="en-CA"/>
-              </w:rPr>
-              <w:t>}}, {{</w:t>
-            </w:r>
-            <w:proofErr w:type="spellStart"/>
-            <w:r>
-              <w:rPr>
-                <w:rFonts w:ascii="BC Sans" w:hAnsi="BC Sans"/>
-                <w:color w:val="000000" w:themeColor="text1"/>
-                <w:lang w:val="en-CA"/>
-              </w:rPr>
-              <w:t>BLAccountPhysicalAddressState</w:t>
-            </w:r>
-            <w:r>
-              <w:rPr>
-                <w:rFonts w:ascii="BC Sans" w:hAnsi="BC Sans"/>
-                <w:color w:val="000000" w:themeColor="text1"/>
-                <w:lang w:val="en-CA"/>
-              </w:rPr>
-              <w:t>Code</w:t>
-            </w:r>
-            <w:proofErr w:type="spellEnd"/>
-            <w:r>
-              <w:rPr>
-                <w:rFonts w:ascii="BC Sans" w:hAnsi="BC Sans"/>
-                <w:color w:val="000000" w:themeColor="text1"/>
-                <w:lang w:val="en-CA"/>
-              </w:rPr>
-              <w:t>}}</w:t>
-            </w:r>
-            <w:r>
-              <w:rPr>
-                <w:rFonts w:ascii="BC Sans" w:hAnsi="BC Sans"/>
-                <w:color w:val="000000" w:themeColor="text1"/>
-                <w:lang w:val="en-CA"/>
-              </w:rPr>
-              <w:br/>
-              <w:t>{{</w:t>
-            </w:r>
-            <w:proofErr w:type="spellStart"/>
-            <w:r>
-              <w:rPr>
-                <w:rFonts w:ascii="BC Sans" w:hAnsi="BC Sans"/>
-                <w:color w:val="000000" w:themeColor="text1"/>
-                <w:lang w:val="en-CA"/>
-              </w:rPr>
-              <w:t>BLAccountPhysicalAddressPostalCode</w:t>
-            </w:r>
-            <w:proofErr w:type="spellEnd"/>
-            <w:r>
-              <w:rPr>
-                <w:rFonts w:ascii="BC Sans" w:hAnsi="BC Sans"/>
-                <w:color w:val="000000" w:themeColor="text1"/>
-                <w:lang w:val="en-CA"/>
-              </w:rPr>
-              <w:t>}}</w:t>
+              <w:t>{{BLAccountPhysicalAddressPostalCode}}</w:t>
             </w:r>
             <w:r>
               <w:rPr>
@@ -1221,23 +852,7 @@
                 <w:rFonts w:ascii="BC Sans" w:hAnsi="BC Sans"/>
                 <w:color w:val="000000" w:themeColor="text1"/>
               </w:rPr>
-              <w:t>{{</w:t>
-            </w:r>
-            <w:proofErr w:type="spellStart"/>
-            <w:r>
-              <w:rPr>
-                <w:rFonts w:ascii="BC Sans" w:hAnsi="BC Sans"/>
-                <w:color w:val="000000" w:themeColor="text1"/>
-              </w:rPr>
-              <w:t>BLAccountId</w:t>
-            </w:r>
-            <w:proofErr w:type="spellEnd"/>
-            <w:r>
-              <w:rPr>
-                <w:rFonts w:ascii="BC Sans" w:hAnsi="BC Sans"/>
-                <w:color w:val="000000" w:themeColor="text1"/>
-              </w:rPr>
-              <w:t>}}</w:t>
+              <w:t>{{BLAccountId}}</w:t>
             </w:r>
           </w:p>
         </w:tc>
@@ -1280,23 +895,7 @@
                 <w:rFonts w:ascii="BC Sans" w:hAnsi="BC Sans"/>
                 <w:color w:val="000000" w:themeColor="text1"/>
               </w:rPr>
-              <w:t>{{</w:t>
-            </w:r>
-            <w:proofErr w:type="spellStart"/>
-            <w:r>
-              <w:rPr>
-                <w:rFonts w:ascii="BC Sans" w:hAnsi="BC Sans"/>
-                <w:color w:val="000000" w:themeColor="text1"/>
-              </w:rPr>
-              <w:t>BLIdentifier</w:t>
-            </w:r>
-            <w:proofErr w:type="spellEnd"/>
-            <w:r>
-              <w:rPr>
-                <w:rFonts w:ascii="BC Sans" w:hAnsi="BC Sans"/>
-                <w:color w:val="000000" w:themeColor="text1"/>
-              </w:rPr>
-              <w:t>}}</w:t>
+              <w:t>{{BLIdentifier}}</w:t>
             </w:r>
           </w:p>
           <w:p>
@@ -1353,23 +952,7 @@
                 <w:rFonts w:ascii="BC Sans" w:hAnsi="BC Sans"/>
                 <w:color w:val="000000" w:themeColor="text1"/>
               </w:rPr>
-              <w:t>{{</w:t>
-            </w:r>
-            <w:proofErr w:type="spellStart"/>
-            <w:r>
-              <w:rPr>
-                <w:rFonts w:ascii="BC Sans" w:hAnsi="BC Sans"/>
-                <w:color w:val="000000" w:themeColor="text1"/>
-              </w:rPr>
-              <w:t>BLAEngineerofRecordDesigner</w:t>
-            </w:r>
-            <w:proofErr w:type="spellEnd"/>
-            <w:r>
-              <w:rPr>
-                <w:rFonts w:ascii="BC Sans" w:hAnsi="BC Sans"/>
-                <w:color w:val="000000" w:themeColor="text1"/>
-              </w:rPr>
-              <w:t>}},</w:t>
+              <w:t>{{BLAEngineerofRecordDesigner}},</w:t>
             </w:r>
           </w:p>
           <w:p>
@@ -1379,31 +962,13 @@
                 <w:color w:val="000000" w:themeColor="text1"/>
               </w:rPr>
             </w:pPr>
-            <w:proofErr w:type="gramStart"/>
-            <w:r>
-              <w:rPr>
-                <w:rFonts w:ascii="BC Sans" w:hAnsi="BC Sans"/>
-                <w:color w:val="000000" w:themeColor="text1"/>
-              </w:rPr>
-              <w:t>{{</w:t>
-            </w:r>
-            <w:proofErr w:type="spellStart"/>
-            <w:r>
-              <w:rPr>
-                <w:rFonts w:ascii="BC Sans" w:hAnsi="BC Sans"/>
-                <w:color w:val="000000" w:themeColor="text1"/>
-              </w:rPr>
-              <w:t>BLADesignation</w:t>
-            </w:r>
-            <w:proofErr w:type="spellEnd"/>
-            <w:r>
-              <w:rPr>
-                <w:rFonts w:ascii="BC Sans" w:hAnsi="BC Sans"/>
-                <w:color w:val="000000" w:themeColor="text1"/>
-              </w:rPr>
-              <w:t>}},</w:t>
-            </w:r>
-            <w:proofErr w:type="gramEnd"/>
+            <w:r>
+              <w:rPr>
+                <w:rFonts w:ascii="BC Sans" w:hAnsi="BC Sans"/>
+                <w:color w:val="000000" w:themeColor="text1"/>
+              </w:rPr>
+              <w:t>{{BLADesignation}},</w:t>
+            </w:r>
           </w:p>
           <w:p>
             <w:pPr>
@@ -1417,23 +982,7 @@
                 <w:rFonts w:ascii="BC Sans" w:hAnsi="BC Sans"/>
                 <w:color w:val="000000" w:themeColor="text1"/>
               </w:rPr>
-              <w:t>{{</w:t>
-            </w:r>
-            <w:proofErr w:type="spellStart"/>
-            <w:r>
-              <w:rPr>
-                <w:rFonts w:ascii="BC Sans" w:hAnsi="BC Sans"/>
-                <w:color w:val="000000" w:themeColor="text1"/>
-              </w:rPr>
-              <w:t>BLAEngineeringDesignFirmName</w:t>
-            </w:r>
-            <w:proofErr w:type="spellEnd"/>
-            <w:r>
-              <w:rPr>
-                <w:rFonts w:ascii="BC Sans" w:hAnsi="BC Sans"/>
-                <w:color w:val="000000" w:themeColor="text1"/>
-              </w:rPr>
-              <w:t>}}</w:t>
+              <w:t>{{BLAEngineeringDesignFirmName}}</w:t>
             </w:r>
           </w:p>
         </w:tc>
@@ -1481,24 +1030,31 @@
                 <w:color w:val="000000" w:themeColor="text1"/>
                 <w:lang w:val="en-CA"/>
               </w:rPr>
-              <w:t>{{</w:t>
-            </w:r>
-            <w:proofErr w:type="spellStart"/>
+              <w:t>{{BLAEngineeringDesignFirmAddressStreet}}</w:t>
+            </w:r>
             <w:r>
               <w:rPr>
                 <w:rFonts w:ascii="BC Sans" w:hAnsi="BC Sans"/>
                 <w:color w:val="000000" w:themeColor="text1"/>
                 <w:lang w:val="en-CA"/>
               </w:rPr>
-              <w:t>BLAEngineeringDesignFirmAddressStreet</w:t>
-            </w:r>
-            <w:proofErr w:type="spellEnd"/>
+              <w:br/>
+              <w:t>{{BLAEngineeringDesignFirmAddressCity}}, {{BLAEngineeringDesignFirmAddressState</w:t>
+            </w:r>
             <w:r>
               <w:rPr>
                 <w:rFonts w:ascii="BC Sans" w:hAnsi="BC Sans"/>
                 <w:color w:val="000000" w:themeColor="text1"/>
                 <w:lang w:val="en-CA"/>
               </w:rPr>
+              <w:t>Code</w:t>
+            </w:r>
+            <w:r>
+              <w:rPr>
+                <w:rFonts w:ascii="BC Sans" w:hAnsi="BC Sans"/>
+                <w:color w:val="000000" w:themeColor="text1"/>
+                <w:lang w:val="en-CA"/>
+              </w:rPr>
               <w:t>}}</w:t>
             </w:r>
             <w:r>
@@ -1508,78 +1064,7 @@
                 <w:lang w:val="en-CA"/>
               </w:rPr>
               <w:br/>
-              <w:t>{{</w:t>
-            </w:r>
-            <w:proofErr w:type="spellStart"/>
-            <w:r>
-              <w:rPr>
-                <w:rFonts w:ascii="BC Sans" w:hAnsi="BC Sans"/>
-                <w:color w:val="000000" w:themeColor="text1"/>
-                <w:lang w:val="en-CA"/>
-              </w:rPr>
-              <w:t>BLAEngineeringDesignFirmAddressCity</w:t>
-            </w:r>
-            <w:proofErr w:type="spellEnd"/>
-            <w:r>
-              <w:rPr>
-                <w:rFonts w:ascii="BC Sans" w:hAnsi="BC Sans"/>
-                <w:color w:val="000000" w:themeColor="text1"/>
-                <w:lang w:val="en-CA"/>
-              </w:rPr>
-              <w:t>}}, {{</w:t>
-            </w:r>
-            <w:proofErr w:type="spellStart"/>
-            <w:r>
-              <w:rPr>
-                <w:rFonts w:ascii="BC Sans" w:hAnsi="BC Sans"/>
-                <w:color w:val="000000" w:themeColor="text1"/>
-                <w:lang w:val="en-CA"/>
-              </w:rPr>
-              <w:t>BLAEngineeringDesignFirmAddressState</w:t>
-            </w:r>
-            <w:r>
-              <w:rPr>
-                <w:rFonts w:ascii="BC Sans" w:hAnsi="BC Sans"/>
-                <w:color w:val="000000" w:themeColor="text1"/>
-                <w:lang w:val="en-CA"/>
-              </w:rPr>
-              <w:t>Code</w:t>
-            </w:r>
-            <w:proofErr w:type="spellEnd"/>
-            <w:r>
-              <w:rPr>
-                <w:rFonts w:ascii="BC Sans" w:hAnsi="BC Sans"/>
-                <w:color w:val="000000" w:themeColor="text1"/>
-                <w:lang w:val="en-CA"/>
-              </w:rPr>
-              <w:t>}}</w:t>
-            </w:r>
-            <w:r>
-              <w:rPr>
-                <w:rFonts w:ascii="BC Sans" w:hAnsi="BC Sans"/>
-                <w:color w:val="000000" w:themeColor="text1"/>
-                <w:lang w:val="en-CA"/>
-              </w:rPr>
-              <w:br/>
-              <w:t>{{</w:t>
-            </w:r>
-            <w:proofErr w:type="spellStart"/>
-            <w:r>
-              <w:rPr>
-                <w:rFonts w:ascii="BC Sans" w:hAnsi="BC Sans"/>
-                <w:color w:val="000000" w:themeColor="text1"/>
-                <w:lang w:val="en-CA"/>
-              </w:rPr>
-              <w:t>BLAEngineeringDesignFirmAddressPostalCode</w:t>
-            </w:r>
-            <w:proofErr w:type="spellEnd"/>
-            <w:r>
-              <w:rPr>
-                <w:rFonts w:ascii="BC Sans" w:hAnsi="BC Sans"/>
-                <w:color w:val="000000" w:themeColor="text1"/>
-                <w:lang w:val="en-CA"/>
-              </w:rPr>
-              <w:t>}}</w:t>
+              <w:t>{{BLAEngineeringDesignFirmAddressPostalCode}}</w:t>
             </w:r>
             <w:r>
               <w:rPr>
@@ -1642,23 +1127,7 @@
                 <w:rFonts w:ascii="BC Sans" w:hAnsi="BC Sans"/>
                 <w:color w:val="000000" w:themeColor="text1"/>
               </w:rPr>
-              <w:t>{{</w:t>
-            </w:r>
-            <w:proofErr w:type="spellStart"/>
-            <w:r>
-              <w:rPr>
-                <w:rFonts w:ascii="BC Sans" w:hAnsi="BC Sans"/>
-                <w:color w:val="000000" w:themeColor="text1"/>
-              </w:rPr>
-              <w:t>BLEffectiveDate</w:t>
-            </w:r>
-            <w:proofErr w:type="spellEnd"/>
-            <w:r>
-              <w:rPr>
-                <w:rFonts w:ascii="BC Sans" w:hAnsi="BC Sans"/>
-                <w:color w:val="000000" w:themeColor="text1"/>
-              </w:rPr>
-              <w:t>}}</w:t>
+              <w:t>{{BLEffectiveDate}}</w:t>
             </w:r>
           </w:p>
         </w:tc>
@@ -1783,7 +1252,6 @@
           <w:color w:val="000000" w:themeColor="text1"/>
         </w:rPr>
       </w:pPr>
-      <w:proofErr w:type="gramStart"/>
       <w:r>
         <w:rPr>
           <w:rFonts w:ascii="BC Sans" w:hAnsi="BC Sans"/>
@@ -1798,24 +1266,7 @@
           <w:rFonts w:ascii="BC Sans" w:hAnsi="BC Sans"/>
           <w:color w:val="000000" w:themeColor="text1"/>
         </w:rPr>
-        <w:t>{{</w:t>
-      </w:r>
-      <w:proofErr w:type="spellStart"/>
-      <w:proofErr w:type="gramEnd"/>
-      <w:r>
-        <w:rPr>
-          <w:rFonts w:ascii="BC Sans" w:hAnsi="BC Sans"/>
-          <w:color w:val="000000" w:themeColor="text1"/>
-        </w:rPr>
-        <w:t>BLIdentifier</w:t>
-      </w:r>
-      <w:proofErr w:type="spellEnd"/>
-      <w:r>
-        <w:rPr>
-          <w:rFonts w:ascii="BC Sans" w:hAnsi="BC Sans"/>
-          <w:color w:val="000000" w:themeColor="text1"/>
-        </w:rPr>
-        <w:t>}}</w:t>
+        <w:t>{{BLIdentifier}}</w:t>
       </w:r>
       <w:r>
         <w:rPr>
@@ -1833,7 +1284,6 @@
           <w:color w:val="000000" w:themeColor="text1"/>
         </w:rPr>
       </w:pPr>
-      <w:proofErr w:type="gramStart"/>
       <w:r>
         <w:rPr>
           <w:rFonts w:ascii="BC Sans" w:hAnsi="BC Sans"/>
@@ -1848,24 +1298,7 @@
           <w:rFonts w:ascii="BC Sans" w:hAnsi="BC Sans"/>
           <w:color w:val="000000" w:themeColor="text1"/>
         </w:rPr>
-        <w:t>{{</w:t>
-      </w:r>
-      <w:proofErr w:type="spellStart"/>
-      <w:proofErr w:type="gramEnd"/>
-      <w:r>
-        <w:rPr>
-          <w:rFonts w:ascii="BC Sans" w:hAnsi="BC Sans"/>
-          <w:color w:val="000000" w:themeColor="text1"/>
-        </w:rPr>
-        <w:t>BLOrganizationName</w:t>
-      </w:r>
-      <w:proofErr w:type="spellEnd"/>
-      <w:r>
-        <w:rPr>
-          <w:rFonts w:ascii="BC Sans" w:hAnsi="BC Sans"/>
-          <w:color w:val="000000" w:themeColor="text1"/>
-        </w:rPr>
-        <w:t>}}</w:t>
+        <w:t>{{BLOrganizationName}}</w:t>
       </w:r>
     </w:p>
     <w:p>
@@ -1959,21 +1392,7 @@
               <w:rPr>
                 <w:rFonts w:ascii="BC Sans" w:hAnsi="BC Sans"/>
               </w:rPr>
-              <w:t>{{#IF_isConditionNotPresent}} None {{/</w:t>
-            </w:r>
-            <w:proofErr w:type="spellStart"/>
-            <w:r>
-              <w:rPr>
-                <w:rFonts w:ascii="BC Sans" w:hAnsi="BC Sans"/>
-              </w:rPr>
-              <w:t>IF_isConditionNotPresent</w:t>
-            </w:r>
-            <w:proofErr w:type="spellEnd"/>
-            <w:r>
-              <w:rPr>
-                <w:rFonts w:ascii="BC Sans" w:hAnsi="BC Sans"/>
-              </w:rPr>
-              <w:t>}}</w:t>
+              <w:t>{{#IF_isConditionNotPresent}} None {{/IF_isConditionNotPresent}}</w:t>
             </w:r>
           </w:p>
           <w:p>
@@ -2179,32 +1598,7 @@
           <w:rFonts w:ascii="BC Sans" w:hAnsi="BC Sans"/>
           <w:color w:val="000000" w:themeColor="text1"/>
         </w:rPr>
-        <w:t xml:space="preserve">                                                            Permit </w:t>
-      </w:r>
-      <w:proofErr w:type="gramStart"/>
-      <w:r>
-        <w:rPr>
-          <w:rFonts w:ascii="BC Sans" w:hAnsi="BC Sans"/>
-          <w:color w:val="000000" w:themeColor="text1"/>
-        </w:rPr>
-        <w:t>Number: {{</w:t>
-      </w:r>
-      <w:proofErr w:type="spellStart"/>
-      <w:proofErr w:type="gramEnd"/>
-      <w:r>
-        <w:rPr>
-          <w:rFonts w:ascii="BC Sans" w:hAnsi="BC Sans"/>
-          <w:color w:val="000000" w:themeColor="text1"/>
-        </w:rPr>
-        <w:t>BLIdentifier</w:t>
-      </w:r>
-      <w:proofErr w:type="spellEnd"/>
-      <w:r>
-        <w:rPr>
-          <w:rFonts w:ascii="BC Sans" w:hAnsi="BC Sans"/>
-          <w:color w:val="000000" w:themeColor="text1"/>
-        </w:rPr>
-        <w:t>}}</w:t>
+        <w:t xml:space="preserve">                                                            Permit Number: {{BLIdentifier}}</w:t>
       </w:r>
       <w:r>
         <w:rPr>
@@ -2277,7 +1671,6 @@
                 <w:color w:val="000000" w:themeColor="text1"/>
               </w:rPr>
             </w:pPr>
-            <w:proofErr w:type="gramStart"/>
             <w:r>
               <w:rPr>
                 <w:rFonts w:ascii="BC Sans" w:hAnsi="BC Sans"/>
@@ -2292,18 +1685,34 @@
                 <w:rFonts w:ascii="BC Sans" w:hAnsi="BC Sans"/>
                 <w:color w:val="000000" w:themeColor="text1"/>
               </w:rPr>
+              <w:t>{{BLAClosedByName}}</w:t>
+            </w:r>
+          </w:p>
+          <w:p>
+            <w:pPr>
+              <w:tabs>
+                <w:tab w:val="center" w:pos="2330"/>
+              </w:tabs>
+              <w:spacing w:after="50"/>
+              <w:rPr>
+                <w:rFonts w:ascii="BC Sans" w:hAnsi="BC Sans"/>
+                <w:color w:val="000000" w:themeColor="text1"/>
+              </w:rPr>
+            </w:pPr>
+            <w:r>
+              <w:rPr>
+                <w:rFonts w:ascii="BC Sans" w:hAnsi="BC Sans"/>
+                <w:color w:val="000000" w:themeColor="text1"/>
+              </w:rPr>
               <w:t>{{</w:t>
             </w:r>
-            <w:proofErr w:type="spellStart"/>
-            <w:proofErr w:type="gramEnd"/>
-            <w:r>
-              <w:rPr>
-                <w:rFonts w:ascii="BC Sans" w:hAnsi="BC Sans"/>
-                <w:color w:val="000000" w:themeColor="text1"/>
-              </w:rPr>
-              <w:t>BLAClosedByName</w:t>
-            </w:r>
-            <w:proofErr w:type="spellEnd"/>
+            <w:r>
+              <w:rPr>
+                <w:rFonts w:ascii="BC Sans" w:hAnsi="BC Sans"/>
+                <w:color w:val="000000" w:themeColor="text1"/>
+              </w:rPr>
+              <w:t>FacilityHAName</w:t>
+            </w:r>
             <w:r>
               <w:rPr>
                 <w:rFonts w:ascii="BC Sans" w:hAnsi="BC Sans"/>
@@ -2346,23 +1755,7 @@
                 <w:rFonts w:ascii="BC Sans" w:hAnsi="BC Sans"/>
                 <w:color w:val="000000" w:themeColor="text1"/>
               </w:rPr>
-              <w:t>{{</w:t>
-            </w:r>
-            <w:proofErr w:type="spellStart"/>
-            <w:r>
-              <w:rPr>
-                <w:rFonts w:ascii="BC Sans" w:hAnsi="BC Sans"/>
-                <w:color w:val="000000" w:themeColor="text1"/>
-              </w:rPr>
-              <w:t>FacilityHAAddressInline</w:t>
-            </w:r>
-            <w:proofErr w:type="spellEnd"/>
-            <w:r>
-              <w:rPr>
-                <w:rFonts w:ascii="BC Sans" w:hAnsi="BC Sans"/>
-                <w:color w:val="000000" w:themeColor="text1"/>
-              </w:rPr>
-              <w:t>}}</w:t>
+              <w:t>{{FacilityHAAddressInline}}</w:t>
             </w:r>
           </w:p>
         </w:tc>
@@ -2388,15 +1781,7 @@
                 <w:rFonts w:ascii="BC Sans" w:hAnsi="BC Sans"/>
                 <w:color w:val="000000"/>
               </w:rPr>
-              <w:t> </w:t>
-            </w:r>
-            <w:proofErr w:type="gramStart"/>
-            <w:r>
-              <w:rPr>
-                <w:rFonts w:ascii="BC Sans" w:hAnsi="BC Sans"/>
-                <w:color w:val="000000"/>
-              </w:rPr>
-              <w:t>  </w:t>
+              <w:t>   </w:t>
             </w:r>
             <w:r>
               <w:rPr>
@@ -2412,17 +1797,7 @@
                 <w:iCs/>
                 <w:color w:val="000000" w:themeColor="text1"/>
               </w:rPr>
-              <w:t>[</w:t>
-            </w:r>
-            <w:proofErr w:type="gramEnd"/>
-            <w:r>
-              <w:rPr>
-                <w:rFonts w:ascii="BC Sans" w:hAnsi="BC Sans"/>
-                <w:i/>
-                <w:iCs/>
-                <w:color w:val="000000" w:themeColor="text1"/>
-              </w:rPr>
-              <w:t>Project Name]</w:t>
+              <w:t>[Project Name]</w:t>
             </w:r>
           </w:p>
           <w:p>
@@ -2566,23 +1941,7 @@
                 <w:rFonts w:ascii="BC Sans" w:hAnsi="BC Sans"/>
                 <w:color w:val="000000" w:themeColor="text1"/>
               </w:rPr>
-              <w:t>{{</w:t>
-            </w:r>
-            <w:proofErr w:type="spellStart"/>
-            <w:r>
-              <w:rPr>
-                <w:rFonts w:ascii="BC Sans" w:hAnsi="BC Sans"/>
-                <w:color w:val="000000" w:themeColor="text1"/>
-              </w:rPr>
-              <w:t>BLAEngineerofRecordDesigner</w:t>
-            </w:r>
-            <w:proofErr w:type="spellEnd"/>
-            <w:r>
-              <w:rPr>
-                <w:rFonts w:ascii="BC Sans" w:hAnsi="BC Sans"/>
-                <w:color w:val="000000" w:themeColor="text1"/>
-              </w:rPr>
-              <w:t>}}</w:t>
+              <w:t>{{BLAEngineerofRecordDesigner}}</w:t>
             </w:r>
           </w:p>
           <w:p>
@@ -2619,23 +1978,7 @@
                 <w:rFonts w:ascii="BC Sans" w:hAnsi="BC Sans"/>
                 <w:color w:val="000000" w:themeColor="text1"/>
               </w:rPr>
-              <w:t>{{</w:t>
-            </w:r>
-            <w:proofErr w:type="spellStart"/>
-            <w:r>
-              <w:rPr>
-                <w:rFonts w:ascii="BC Sans" w:hAnsi="BC Sans"/>
-                <w:color w:val="000000" w:themeColor="text1"/>
-              </w:rPr>
-              <w:t>BLAEngineeringDesignFirmName</w:t>
-            </w:r>
-            <w:proofErr w:type="spellEnd"/>
-            <w:r>
-              <w:rPr>
-                <w:rFonts w:ascii="BC Sans" w:hAnsi="BC Sans"/>
-                <w:color w:val="000000" w:themeColor="text1"/>
-              </w:rPr>
-              <w:t>}}</w:t>
+              <w:t>{{BLAEngineeringDesignFirmName}}</w:t>
             </w:r>
           </w:p>
           <w:p>
@@ -2672,15 +2015,7 @@
                 <w:rFonts w:ascii="BC Sans" w:hAnsi="BC Sans"/>
                 <w:color w:val="000000" w:themeColor="text1"/>
               </w:rPr>
-              <w:t>{{</w:t>
-            </w:r>
-            <w:proofErr w:type="spellStart"/>
-            <w:r>
-              <w:rPr>
-                <w:rFonts w:ascii="BC Sans" w:hAnsi="BC Sans"/>
-                <w:color w:val="000000" w:themeColor="text1"/>
-              </w:rPr>
-              <w:t>BLAEngineeringDesignFirmAddress</w:t>
+              <w:t>{{BLAEngineeringDesignFirmAddress</w:t>
             </w:r>
             <w:r>
               <w:rPr>
@@ -2694,15 +2029,7 @@
                 <w:rFonts w:ascii="BC Sans" w:hAnsi="BC Sans"/>
                 <w:color w:val="000000" w:themeColor="text1"/>
               </w:rPr>
-              <w:t>treet</w:t>
-            </w:r>
-            <w:proofErr w:type="spellEnd"/>
-            <w:r>
-              <w:rPr>
-                <w:rFonts w:ascii="BC Sans" w:hAnsi="BC Sans"/>
-                <w:color w:val="000000" w:themeColor="text1"/>
-              </w:rPr>
-              <w:t>}}</w:t>
+              <w:t>treet}}</w:t>
             </w:r>
           </w:p>
           <w:p>
@@ -2740,7 +2067,13 @@
                 <w:color w:val="000000" w:themeColor="text1"/>
               </w:rPr>
             </w:pPr>
-            <w:proofErr w:type="gramStart"/>
+            <w:r>
+              <w:rPr>
+                <w:rFonts w:ascii="BC Sans" w:hAnsi="BC Sans"/>
+                <w:color w:val="000000" w:themeColor="text1"/>
+              </w:rPr>
+              <w:t xml:space="preserve">{{BLAEngineeringDesignFirmAddressCity}}, </w:t>
+            </w:r>
             <w:r>
               <w:rPr>
                 <w:rFonts w:ascii="BC Sans" w:hAnsi="BC Sans"/>
@@ -2748,21 +2081,33 @@
               </w:rPr>
               <w:t>{{</w:t>
             </w:r>
-            <w:proofErr w:type="spellStart"/>
-            <w:r>
-              <w:rPr>
-                <w:rFonts w:ascii="BC Sans" w:hAnsi="BC Sans"/>
-                <w:color w:val="000000" w:themeColor="text1"/>
-              </w:rPr>
-              <w:t>BLAEngineeringDesignFirmAddressCity</w:t>
-            </w:r>
-            <w:proofErr w:type="spellEnd"/>
-            <w:r>
-              <w:rPr>
-                <w:rFonts w:ascii="BC Sans" w:hAnsi="BC Sans"/>
-                <w:color w:val="000000" w:themeColor="text1"/>
-              </w:rPr>
-              <w:t xml:space="preserve">}}, </w:t>
+            <w:r>
+              <w:rPr>
+                <w:rFonts w:ascii="BC Sans" w:hAnsi="BC Sans"/>
+                <w:color w:val="000000" w:themeColor="text1"/>
+              </w:rPr>
+              <w:t>BLAEngineeringDesignFirmAddressState</w:t>
+            </w:r>
+            <w:r>
+              <w:rPr>
+                <w:rFonts w:ascii="BC Sans" w:hAnsi="BC Sans"/>
+                <w:color w:val="000000" w:themeColor="text1"/>
+              </w:rPr>
+              <w:t>Code</w:t>
+            </w:r>
+            <w:r>
+              <w:rPr>
+                <w:rFonts w:ascii="BC Sans" w:hAnsi="BC Sans"/>
+                <w:color w:val="000000" w:themeColor="text1"/>
+              </w:rPr>
+              <w:t>}}</w:t>
+            </w:r>
+            <w:r>
+              <w:rPr>
+                <w:rFonts w:ascii="BC Sans" w:hAnsi="BC Sans"/>
+                <w:color w:val="000000" w:themeColor="text1"/>
+              </w:rPr>
+              <w:t xml:space="preserve">, </w:t>
             </w:r>
             <w:r>
               <w:rPr>
@@ -2771,45 +2116,6 @@
               </w:rPr>
               <w:t>{{</w:t>
             </w:r>
-            <w:proofErr w:type="spellStart"/>
-            <w:r>
-              <w:rPr>
-                <w:rFonts w:ascii="BC Sans" w:hAnsi="BC Sans"/>
-                <w:color w:val="000000" w:themeColor="text1"/>
-              </w:rPr>
-              <w:t>BLAEngineeringDesignFirmAddressState</w:t>
-            </w:r>
-            <w:r>
-              <w:rPr>
-                <w:rFonts w:ascii="BC Sans" w:hAnsi="BC Sans"/>
-                <w:color w:val="000000" w:themeColor="text1"/>
-              </w:rPr>
-              <w:t>Code</w:t>
-            </w:r>
-            <w:proofErr w:type="spellEnd"/>
-            <w:r>
-              <w:rPr>
-                <w:rFonts w:ascii="BC Sans" w:hAnsi="BC Sans"/>
-                <w:color w:val="000000" w:themeColor="text1"/>
-              </w:rPr>
-              <w:t>}}</w:t>
-            </w:r>
-            <w:r>
-              <w:rPr>
-                <w:rFonts w:ascii="BC Sans" w:hAnsi="BC Sans"/>
-                <w:color w:val="000000" w:themeColor="text1"/>
-              </w:rPr>
-              <w:t xml:space="preserve">, </w:t>
-            </w:r>
-            <w:r>
-              <w:rPr>
-                <w:rFonts w:ascii="BC Sans" w:hAnsi="BC Sans"/>
-                <w:color w:val="000000" w:themeColor="text1"/>
-              </w:rPr>
-              <w:t>{{</w:t>
-            </w:r>
-            <w:proofErr w:type="spellStart"/>
-            <w:proofErr w:type="gramEnd"/>
             <w:r>
               <w:rPr>
                 <w:rFonts w:ascii="BC Sans" w:hAnsi="BC Sans"/>
@@ -2817,7 +2123,6 @@
               </w:rPr>
               <w:t>BLAEngineeringDesignFirmAddressPostalCode</w:t>
             </w:r>
-            <w:proofErr w:type="spellEnd"/>
             <w:r>
               <w:rPr>
                 <w:rFonts w:ascii="BC Sans" w:hAnsi="BC Sans"/>
@@ -2951,23 +2256,7 @@
                 <w:rFonts w:ascii="BC Sans" w:hAnsi="BC Sans"/>
                 <w:color w:val="000000" w:themeColor="text1"/>
               </w:rPr>
-              <w:t>{{</w:t>
-            </w:r>
-            <w:proofErr w:type="spellStart"/>
-            <w:r>
-              <w:rPr>
-                <w:rFonts w:ascii="BC Sans" w:hAnsi="BC Sans"/>
-                <w:color w:val="000000" w:themeColor="text1"/>
-              </w:rPr>
-              <w:t>BLEffectiveDate</w:t>
-            </w:r>
-            <w:proofErr w:type="spellEnd"/>
-            <w:r>
-              <w:rPr>
-                <w:rFonts w:ascii="BC Sans" w:hAnsi="BC Sans"/>
-                <w:color w:val="000000" w:themeColor="text1"/>
-              </w:rPr>
-              <w:t>}}</w:t>
+              <w:t>{{BLEffectiveDate}}</w:t>
             </w:r>
           </w:p>
           <w:p>
@@ -3366,29 +2655,7 @@
         <w:lang w:val="en-CA" w:eastAsia="en-CA"/>
         <w14:ligatures w14:val="standardContextual"/>
       </w:rPr>
-      <w:t>{{/</w:t>
-    </w:r>
-    <w:proofErr w:type="spellStart"/>
-    <w:r>
-      <w:rPr>
-        <w:kern w:val="2"/>
-        <w:sz w:val="14"/>
-        <w:szCs w:val="14"/>
-        <w:lang w:val="en-CA" w:eastAsia="en-CA"/>
-        <w14:ligatures w14:val="standardContextual"/>
-      </w:rPr>
-      <w:t>IF_HA_Northern</w:t>
-    </w:r>
-    <w:proofErr w:type="spellEnd"/>
-    <w:r>
-      <w:rPr>
-        <w:kern w:val="2"/>
-        <w:sz w:val="14"/>
-        <w:szCs w:val="14"/>
-        <w:lang w:val="en-CA" w:eastAsia="en-CA"/>
-        <w14:ligatures w14:val="standardContextual"/>
-      </w:rPr>
-      <w:t>}}</w:t>
+      <w:t>{{/IF_HA_Northern}}</w:t>
     </w:r>
     <w:r>
       <w:rPr>
@@ -3462,29 +2729,7 @@
         <w:lang w:val="en-CA" w:eastAsia="en-CA"/>
         <w14:ligatures w14:val="standardContextual"/>
       </w:rPr>
-      <w:t>{{/</w:t>
-    </w:r>
-    <w:proofErr w:type="spellStart"/>
-    <w:r>
-      <w:rPr>
-        <w:kern w:val="2"/>
-        <w:sz w:val="14"/>
-        <w:szCs w:val="14"/>
-        <w:lang w:val="en-CA" w:eastAsia="en-CA"/>
-        <w14:ligatures w14:val="standardContextual"/>
-      </w:rPr>
-      <w:t>IF_HA_Interior</w:t>
-    </w:r>
-    <w:proofErr w:type="spellEnd"/>
-    <w:r>
-      <w:rPr>
-        <w:kern w:val="2"/>
-        <w:sz w:val="14"/>
-        <w:szCs w:val="14"/>
-        <w:lang w:val="en-CA" w:eastAsia="en-CA"/>
-        <w14:ligatures w14:val="standardContextual"/>
-      </w:rPr>
-      <w:t>}}</w:t>
+      <w:t>{{/IF_HA_Interior}}</w:t>
     </w:r>
     <w:r>
       <w:rPr>
@@ -3557,29 +2802,7 @@
         <w:lang w:val="en-CA" w:eastAsia="en-CA"/>
         <w14:ligatures w14:val="standardContextual"/>
       </w:rPr>
-      <w:t>{{/</w:t>
-    </w:r>
-    <w:proofErr w:type="spellStart"/>
-    <w:r>
-      <w:rPr>
-        <w:kern w:val="2"/>
-        <w:sz w:val="14"/>
-        <w:szCs w:val="14"/>
-        <w:lang w:val="en-CA" w:eastAsia="en-CA"/>
-        <w14:ligatures w14:val="standardContextual"/>
-      </w:rPr>
-      <w:t>IF_HA_Island</w:t>
-    </w:r>
-    <w:proofErr w:type="spellEnd"/>
-    <w:r>
-      <w:rPr>
-        <w:kern w:val="2"/>
-        <w:sz w:val="14"/>
-        <w:szCs w:val="14"/>
-        <w:lang w:val="en-CA" w:eastAsia="en-CA"/>
-        <w14:ligatures w14:val="standardContextual"/>
-      </w:rPr>
-      <w:t>}}</w:t>
+      <w:t>{{/IF_HA_Island}}</w:t>
     </w:r>
     <w:r>
       <w:rPr>
@@ -3653,29 +2876,7 @@
         <w:lang w:val="en-CA" w:eastAsia="en-CA"/>
         <w14:ligatures w14:val="standardContextual"/>
       </w:rPr>
-      <w:t>{{/</w:t>
-    </w:r>
-    <w:proofErr w:type="spellStart"/>
-    <w:r>
-      <w:rPr>
-        <w:kern w:val="2"/>
-        <w:sz w:val="14"/>
-        <w:szCs w:val="14"/>
-        <w:lang w:val="en-CA" w:eastAsia="en-CA"/>
-        <w14:ligatures w14:val="standardContextual"/>
-      </w:rPr>
-      <w:t>IF_HA_VancouverCoastal</w:t>
-    </w:r>
-    <w:proofErr w:type="spellEnd"/>
-    <w:r>
-      <w:rPr>
-        <w:kern w:val="2"/>
-        <w:sz w:val="14"/>
-        <w:szCs w:val="14"/>
-        <w:lang w:val="en-CA" w:eastAsia="en-CA"/>
-        <w14:ligatures w14:val="standardContextual"/>
-      </w:rPr>
-      <w:t>}}</w:t>
+      <w:t>{{/IF_HA_VancouverCoastal}}</w:t>
     </w:r>
     <w:r>
       <w:rPr>
@@ -3749,29 +2950,7 @@
         <w:lang w:val="en-CA" w:eastAsia="en-CA"/>
         <w14:ligatures w14:val="standardContextual"/>
       </w:rPr>
-      <w:t>{{/</w:t>
-    </w:r>
-    <w:proofErr w:type="spellStart"/>
-    <w:r>
-      <w:rPr>
-        <w:kern w:val="2"/>
-        <w:sz w:val="14"/>
-        <w:szCs w:val="14"/>
-        <w:lang w:val="en-CA" w:eastAsia="en-CA"/>
-        <w14:ligatures w14:val="standardContextual"/>
-      </w:rPr>
-      <w:t>IF_HA_Fraser</w:t>
-    </w:r>
-    <w:proofErr w:type="spellEnd"/>
-    <w:r>
-      <w:rPr>
-        <w:kern w:val="2"/>
-        <w:sz w:val="14"/>
-        <w:szCs w:val="14"/>
-        <w:lang w:val="en-CA" w:eastAsia="en-CA"/>
-        <w14:ligatures w14:val="standardContextual"/>
-      </w:rPr>
-      <w:t>}}</w:t>
+      <w:t>{{/IF_HA_Fraser}}</w:t>
     </w:r>
   </w:p>
   <w:p>
@@ -3857,29 +3036,7 @@
         <w:lang w:val="en-CA" w:eastAsia="en-CA"/>
         <w14:ligatures w14:val="standardContextual"/>
       </w:rPr>
-      <w:t>{{/</w:t>
-    </w:r>
-    <w:proofErr w:type="spellStart"/>
-    <w:r>
-      <w:rPr>
-        <w:kern w:val="2"/>
-        <w:sz w:val="14"/>
-        <w:szCs w:val="14"/>
-        <w:lang w:val="en-CA" w:eastAsia="en-CA"/>
-        <w14:ligatures w14:val="standardContextual"/>
-      </w:rPr>
-      <w:t>IF_HA_Northern</w:t>
-    </w:r>
-    <w:proofErr w:type="spellEnd"/>
-    <w:r>
-      <w:rPr>
-        <w:kern w:val="2"/>
-        <w:sz w:val="14"/>
-        <w:szCs w:val="14"/>
-        <w:lang w:val="en-CA" w:eastAsia="en-CA"/>
-        <w14:ligatures w14:val="standardContextual"/>
-      </w:rPr>
-      <w:t>}}</w:t>
+      <w:t>{{/IF_HA_Northern}}</w:t>
     </w:r>
     <w:r>
       <w:rPr>
@@ -3953,29 +3110,7 @@
         <w:lang w:val="en-CA" w:eastAsia="en-CA"/>
         <w14:ligatures w14:val="standardContextual"/>
       </w:rPr>
-      <w:t>{{/</w:t>
-    </w:r>
-    <w:proofErr w:type="spellStart"/>
-    <w:r>
-      <w:rPr>
-        <w:kern w:val="2"/>
-        <w:sz w:val="14"/>
-        <w:szCs w:val="14"/>
-        <w:lang w:val="en-CA" w:eastAsia="en-CA"/>
-        <w14:ligatures w14:val="standardContextual"/>
-      </w:rPr>
-      <w:t>IF_HA_Interior</w:t>
-    </w:r>
-    <w:proofErr w:type="spellEnd"/>
-    <w:r>
-      <w:rPr>
-        <w:kern w:val="2"/>
-        <w:sz w:val="14"/>
-        <w:szCs w:val="14"/>
-        <w:lang w:val="en-CA" w:eastAsia="en-CA"/>
-        <w14:ligatures w14:val="standardContextual"/>
-      </w:rPr>
-      <w:t>}}</w:t>
+      <w:t>{{/IF_HA_Interior}}</w:t>
     </w:r>
     <w:r>
       <w:rPr>
@@ -4048,29 +3183,7 @@
         <w:lang w:val="en-CA" w:eastAsia="en-CA"/>
         <w14:ligatures w14:val="standardContextual"/>
       </w:rPr>
-      <w:t>{{/</w:t>
-    </w:r>
-    <w:proofErr w:type="spellStart"/>
-    <w:r>
-      <w:rPr>
-        <w:kern w:val="2"/>
-        <w:sz w:val="14"/>
-        <w:szCs w:val="14"/>
-        <w:lang w:val="en-CA" w:eastAsia="en-CA"/>
-        <w14:ligatures w14:val="standardContextual"/>
-      </w:rPr>
-      <w:t>IF_HA_Island</w:t>
-    </w:r>
-    <w:proofErr w:type="spellEnd"/>
-    <w:r>
-      <w:rPr>
-        <w:kern w:val="2"/>
-        <w:sz w:val="14"/>
-        <w:szCs w:val="14"/>
-        <w:lang w:val="en-CA" w:eastAsia="en-CA"/>
-        <w14:ligatures w14:val="standardContextual"/>
-      </w:rPr>
-      <w:t>}}</w:t>
+      <w:t>{{/IF_HA_Island}}</w:t>
     </w:r>
     <w:r>
       <w:rPr>
@@ -4144,29 +3257,7 @@
         <w:lang w:val="en-CA" w:eastAsia="en-CA"/>
         <w14:ligatures w14:val="standardContextual"/>
       </w:rPr>
-      <w:t>{{/</w:t>
-    </w:r>
-    <w:proofErr w:type="spellStart"/>
-    <w:r>
-      <w:rPr>
-        <w:kern w:val="2"/>
-        <w:sz w:val="14"/>
-        <w:szCs w:val="14"/>
-        <w:lang w:val="en-CA" w:eastAsia="en-CA"/>
-        <w14:ligatures w14:val="standardContextual"/>
-      </w:rPr>
-      <w:t>IF_HA_VancouverCoastal</w:t>
-    </w:r>
-    <w:proofErr w:type="spellEnd"/>
-    <w:r>
-      <w:rPr>
-        <w:kern w:val="2"/>
-        <w:sz w:val="14"/>
-        <w:szCs w:val="14"/>
-        <w:lang w:val="en-CA" w:eastAsia="en-CA"/>
-        <w14:ligatures w14:val="standardContextual"/>
-      </w:rPr>
-      <w:t>}}</w:t>
+      <w:t>{{/IF_HA_VancouverCoastal}}</w:t>
     </w:r>
     <w:r>
       <w:rPr>
@@ -4240,29 +3331,7 @@
         <w:lang w:val="en-CA" w:eastAsia="en-CA"/>
         <w14:ligatures w14:val="standardContextual"/>
       </w:rPr>
-      <w:t>{{/</w:t>
-    </w:r>
-    <w:proofErr w:type="spellStart"/>
-    <w:r>
-      <w:rPr>
-        <w:kern w:val="2"/>
-        <w:sz w:val="14"/>
-        <w:szCs w:val="14"/>
-        <w:lang w:val="en-CA" w:eastAsia="en-CA"/>
-        <w14:ligatures w14:val="standardContextual"/>
-      </w:rPr>
-      <w:t>IF_HA_Fraser</w:t>
-    </w:r>
-    <w:proofErr w:type="spellEnd"/>
-    <w:r>
-      <w:rPr>
-        <w:kern w:val="2"/>
-        <w:sz w:val="14"/>
-        <w:szCs w:val="14"/>
-        <w:lang w:val="en-CA" w:eastAsia="en-CA"/>
-        <w14:ligatures w14:val="standardContextual"/>
-      </w:rPr>
-      <w:t>}}</w:t>
+      <w:t>{{/IF_HA_Fraser}}</w:t>
     </w:r>
   </w:p>
   <w:p>
@@ -4348,29 +3417,7 @@
         <w:lang w:val="en-CA" w:eastAsia="en-CA"/>
         <w14:ligatures w14:val="standardContextual"/>
       </w:rPr>
-      <w:t>{{/</w:t>
-    </w:r>
-    <w:proofErr w:type="spellStart"/>
-    <w:r>
-      <w:rPr>
-        <w:kern w:val="2"/>
-        <w:sz w:val="14"/>
-        <w:szCs w:val="14"/>
-        <w:lang w:val="en-CA" w:eastAsia="en-CA"/>
-        <w14:ligatures w14:val="standardContextual"/>
-      </w:rPr>
-      <w:t>IF_HA_Northern</w:t>
-    </w:r>
-    <w:proofErr w:type="spellEnd"/>
-    <w:r>
-      <w:rPr>
-        <w:kern w:val="2"/>
-        <w:sz w:val="14"/>
-        <w:szCs w:val="14"/>
-        <w:lang w:val="en-CA" w:eastAsia="en-CA"/>
-        <w14:ligatures w14:val="standardContextual"/>
-      </w:rPr>
-      <w:t>}}</w:t>
+      <w:t>{{/IF_HA_Northern}}</w:t>
     </w:r>
     <w:r>
       <w:rPr>
@@ -4444,29 +3491,7 @@
         <w:lang w:val="en-CA" w:eastAsia="en-CA"/>
         <w14:ligatures w14:val="standardContextual"/>
       </w:rPr>
-      <w:t>{{/</w:t>
-    </w:r>
-    <w:proofErr w:type="spellStart"/>
-    <w:r>
-      <w:rPr>
-        <w:kern w:val="2"/>
-        <w:sz w:val="14"/>
-        <w:szCs w:val="14"/>
-        <w:lang w:val="en-CA" w:eastAsia="en-CA"/>
-        <w14:ligatures w14:val="standardContextual"/>
-      </w:rPr>
-      <w:t>IF_HA_Interior</w:t>
-    </w:r>
-    <w:proofErr w:type="spellEnd"/>
-    <w:r>
-      <w:rPr>
-        <w:kern w:val="2"/>
-        <w:sz w:val="14"/>
-        <w:szCs w:val="14"/>
-        <w:lang w:val="en-CA" w:eastAsia="en-CA"/>
-        <w14:ligatures w14:val="standardContextual"/>
-      </w:rPr>
-      <w:t>}}</w:t>
+      <w:t>{{/IF_HA_Interior}}</w:t>
     </w:r>
     <w:r>
       <w:rPr>
@@ -4539,29 +3564,7 @@
         <w:lang w:val="en-CA" w:eastAsia="en-CA"/>
         <w14:ligatures w14:val="standardContextual"/>
       </w:rPr>
-      <w:t>{{/</w:t>
-    </w:r>
-    <w:proofErr w:type="spellStart"/>
-    <w:r>
-      <w:rPr>
-        <w:kern w:val="2"/>
-        <w:sz w:val="14"/>
-        <w:szCs w:val="14"/>
-        <w:lang w:val="en-CA" w:eastAsia="en-CA"/>
-        <w14:ligatures w14:val="standardContextual"/>
-      </w:rPr>
-      <w:t>IF_HA_Island</w:t>
-    </w:r>
-    <w:proofErr w:type="spellEnd"/>
-    <w:r>
-      <w:rPr>
-        <w:kern w:val="2"/>
-        <w:sz w:val="14"/>
-        <w:szCs w:val="14"/>
-        <w:lang w:val="en-CA" w:eastAsia="en-CA"/>
-        <w14:ligatures w14:val="standardContextual"/>
-      </w:rPr>
-      <w:t>}}</w:t>
+      <w:t>{{/IF_HA_Island}}</w:t>
     </w:r>
     <w:r>
       <w:rPr>
@@ -4635,29 +3638,7 @@
         <w:lang w:val="en-CA" w:eastAsia="en-CA"/>
         <w14:ligatures w14:val="standardContextual"/>
       </w:rPr>
-      <w:t>{{/</w:t>
-    </w:r>
-    <w:proofErr w:type="spellStart"/>
-    <w:r>
-      <w:rPr>
-        <w:kern w:val="2"/>
-        <w:sz w:val="14"/>
-        <w:szCs w:val="14"/>
-        <w:lang w:val="en-CA" w:eastAsia="en-CA"/>
-        <w14:ligatures w14:val="standardContextual"/>
-      </w:rPr>
-      <w:t>IF_HA_VancouverCoastal</w:t>
-    </w:r>
-    <w:proofErr w:type="spellEnd"/>
-    <w:r>
-      <w:rPr>
-        <w:kern w:val="2"/>
-        <w:sz w:val="14"/>
-        <w:szCs w:val="14"/>
-        <w:lang w:val="en-CA" w:eastAsia="en-CA"/>
-        <w14:ligatures w14:val="standardContextual"/>
-      </w:rPr>
-      <w:t>}}</w:t>
+      <w:t>{{/IF_HA_VancouverCoastal}}</w:t>
     </w:r>
     <w:r>
       <w:rPr>
@@ -4731,29 +3712,7 @@
         <w:lang w:val="en-CA" w:eastAsia="en-CA"/>
         <w14:ligatures w14:val="standardContextual"/>
       </w:rPr>
-      <w:t>{{/</w:t>
-    </w:r>
-    <w:proofErr w:type="spellStart"/>
-    <w:r>
-      <w:rPr>
-        <w:kern w:val="2"/>
-        <w:sz w:val="14"/>
-        <w:szCs w:val="14"/>
-        <w:lang w:val="en-CA" w:eastAsia="en-CA"/>
-        <w14:ligatures w14:val="standardContextual"/>
-      </w:rPr>
-      <w:t>IF_HA_Fraser</w:t>
-    </w:r>
-    <w:proofErr w:type="spellEnd"/>
-    <w:r>
-      <w:rPr>
-        <w:kern w:val="2"/>
-        <w:sz w:val="14"/>
-        <w:szCs w:val="14"/>
-        <w:lang w:val="en-CA" w:eastAsia="en-CA"/>
-        <w14:ligatures w14:val="standardContextual"/>
-      </w:rPr>
-      <w:t>}}</w:t>
+      <w:t>{{/IF_HA_Fraser}}</w:t>
     </w:r>
     <w:r>
       <w:rPr>
@@ -5501,7 +4460,6 @@
   <w:style w:type="character" w:default="1" w:styleId="DefaultParagraphFont">
     <w:name w:val="Default Paragraph Font"/>
     <w:uiPriority w:val="1"/>
-    <w:semiHidden/>
     <w:unhideWhenUsed/>
   </w:style>
   <w:style w:type="table" w:default="1" w:styleId="TableNormal">

</xml_diff>